<commit_message>
corrected a copy-and-paste error in the Dynamic Analysis Establish Settings Procedure tertiary document
</commit_message>
<xml_diff>
--- a/source/reference_documents/tertiary_documents/implementation/Dynamic Analysis/establish settings/Dynamic Analysis - Establish Settings.docx
+++ b/source/reference_documents/tertiary_documents/implementation/Dynamic Analysis/establish settings/Dynamic Analysis - Establish Settings.docx
@@ -40,7 +40,7 @@
         <w:t xml:space="preserve">Version </w:t>
       </w:r>
       <w:r>
-        <w:t>1</w:t>
+        <w:t>2</w:t>
       </w:r>
     </w:p>
     <w:p>
@@ -57,7 +57,7 @@
         <w:rPr>
           <w:noProof/>
         </w:rPr>
-        <w:t>10/9/25 7:13 AM</w:t>
+        <w:t>10/9/25 7:30 AM</w:t>
       </w:r>
       <w:r>
         <w:fldChar w:fldCharType="end"/>
@@ -104,10 +104,7 @@
         <w:t xml:space="preserve">the </w:t>
       </w:r>
       <w:r>
-        <w:t>threat model</w:t>
-      </w:r>
-      <w:r>
-        <w:t xml:space="preserve"> creation</w:t>
+        <w:t>establish settings</w:t>
       </w:r>
       <w:r>
         <w:t xml:space="preserve"> </w:t>

</xml_diff>

<commit_message>
corrected typos in the Dynamic Analysis Establish Settings Procedure tertiary document
</commit_message>
<xml_diff>
--- a/source/reference_documents/tertiary_documents/implementation/Dynamic Analysis/establish settings/Dynamic Analysis - Establish Settings.docx
+++ b/source/reference_documents/tertiary_documents/implementation/Dynamic Analysis/establish settings/Dynamic Analysis - Establish Settings.docx
@@ -40,7 +40,7 @@
         <w:t xml:space="preserve">Version </w:t>
       </w:r>
       <w:r>
-        <w:t>2</w:t>
+        <w:t>3</w:t>
       </w:r>
     </w:p>
     <w:p>
@@ -57,7 +57,7 @@
         <w:rPr>
           <w:noProof/>
         </w:rPr>
-        <w:t>10/9/25 7:30 AM</w:t>
+        <w:t>10/9/25 8:03 AM</w:t>
       </w:r>
       <w:r>
         <w:fldChar w:fldCharType="end"/>
@@ -549,10 +549,16 @@
         <w:t xml:space="preserve">This document assumes that the reader understands the purpose of </w:t>
       </w:r>
       <w:r>
-        <w:t xml:space="preserve">cybersecurity </w:t>
-      </w:r>
-      <w:r>
-        <w:t>threat modeling</w:t>
+        <w:t>cybersecurity</w:t>
+      </w:r>
+      <w:r>
+        <w:t>-relevant</w:t>
+      </w:r>
+      <w:r>
+        <w:t xml:space="preserve"> </w:t>
+      </w:r>
+      <w:r>
+        <w:t>dynamic analysis</w:t>
       </w:r>
       <w:r>
         <w:t xml:space="preserve">. Further, that the reader has read and understood the AVCDL </w:t>
@@ -780,7 +786,7 @@
         <w:t xml:space="preserve">It is required that the </w:t>
       </w:r>
       <w:r>
-        <w:t>threat modeling</w:t>
+        <w:t>security</w:t>
       </w:r>
       <w:r>
         <w:t xml:space="preserve"> </w:t>

</xml_diff>